<commit_message>
fix: changed elements to fit standard & fixed formatting inconsistencies
</commit_message>
<xml_diff>
--- a/03_Team_Work/Team4/Milestone_2_First_Dozen_Views/IC_Done/CS_M2_Team4_RegistrationInformationTable.docx
+++ b/03_Team_Work/Team4/Milestone_2_First_Dozen_Views/IC_Done/CS_M2_Team4_RegistrationInformationTable.docx
@@ -12,7 +12,7 @@
       </w:pPr>
       <w:r>
         <w:rPr>
-          <w:rFonts w:ascii="Arial" w:hAnsi="Arial" w:cs="Arial"/>
+          <w:rFonts w:ascii="Arial" w:eastAsia="Times New Roman" w:hAnsi="Arial" w:cs="Arial"/>
           <w:b/>
           <w:bCs/>
         </w:rPr>
@@ -32,6 +32,7 @@
       <w:tr>
         <w:trPr>
           <w:cnfStyle w:val="100000000000" w:firstRow="1" w:lastRow="0" w:firstColumn="0" w:lastColumn="0" w:oddVBand="0" w:evenVBand="0" w:oddHBand="0" w:evenHBand="0" w:firstRowFirstColumn="0" w:firstRowLastColumn="0" w:lastRowFirstColumn="0" w:lastRowLastColumn="0"/>
+          <w:tblHeader/>
         </w:trPr>
         <w:tc>
           <w:tcPr>
@@ -89,13 +90,13 @@
                 <w:rFonts w:ascii="Arial" w:hAnsi="Arial" w:cs="Arial"/>
                 <w:b w:val="0"/>
                 <w:bCs w:val="0"/>
+                <w:sz w:val="22"/>
               </w:rPr>
             </w:pPr>
             <w:r>
               <w:rPr>
                 <w:rFonts w:ascii="Arial" w:eastAsia="Times New Roman" w:hAnsi="Arial" w:cs="Arial"/>
-                <w:sz w:val="20"/>
-                <w:szCs w:val="22"/>
+                <w:sz w:val="22"/>
               </w:rPr>
               <w:t>View Name &amp; Number</w:t>
             </w:r>
@@ -110,15 +111,13 @@
               <w:cnfStyle w:val="000000100000" w:firstRow="0" w:lastRow="0" w:firstColumn="0" w:lastColumn="0" w:oddVBand="0" w:evenVBand="0" w:oddHBand="1" w:evenHBand="0" w:firstRowFirstColumn="0" w:firstRowLastColumn="0" w:lastRowFirstColumn="0" w:lastRowLastColumn="0"/>
               <w:rPr>
                 <w:rFonts w:ascii="Arial" w:hAnsi="Arial" w:cs="Arial"/>
-                <w:sz w:val="20"/>
-                <w:szCs w:val="20"/>
-              </w:rPr>
-            </w:pPr>
-            <w:r>
-              <w:rPr>
-                <w:rFonts w:ascii="Arial" w:hAnsi="Arial" w:cs="Arial"/>
-                <w:sz w:val="20"/>
-                <w:szCs w:val="20"/>
+                <w:sz w:val="22"/>
+              </w:rPr>
+            </w:pPr>
+            <w:r>
+              <w:rPr>
+                <w:rFonts w:ascii="Arial" w:hAnsi="Arial" w:cs="Arial"/>
+                <w:sz w:val="22"/>
               </w:rPr>
               <w:t>1.2 Registration</w:t>
             </w:r>
@@ -137,13 +136,13 @@
                 <w:rFonts w:ascii="Arial" w:hAnsi="Arial" w:cs="Arial"/>
                 <w:b w:val="0"/>
                 <w:bCs w:val="0"/>
+                <w:sz w:val="22"/>
               </w:rPr>
             </w:pPr>
             <w:r>
               <w:rPr>
                 <w:rFonts w:ascii="Arial" w:eastAsia="Times New Roman" w:hAnsi="Arial" w:cs="Arial"/>
-                <w:sz w:val="20"/>
-                <w:szCs w:val="22"/>
+                <w:sz w:val="22"/>
               </w:rPr>
               <w:t>Purpose / Design Concern</w:t>
             </w:r>
@@ -158,17 +157,22 @@
               <w:cnfStyle w:val="000000000000" w:firstRow="0" w:lastRow="0" w:firstColumn="0" w:lastColumn="0" w:oddVBand="0" w:evenVBand="0" w:oddHBand="0" w:evenHBand="0" w:firstRowFirstColumn="0" w:firstRowLastColumn="0" w:lastRowFirstColumn="0" w:lastRowLastColumn="0"/>
               <w:rPr>
                 <w:rFonts w:ascii="Arial" w:hAnsi="Arial" w:cs="Arial"/>
-                <w:sz w:val="20"/>
-                <w:szCs w:val="20"/>
-              </w:rPr>
-            </w:pPr>
-            <w:r>
-              <w:rPr>
-                <w:rFonts w:ascii="Arial" w:hAnsi="Arial" w:cs="Arial"/>
-                <w:sz w:val="20"/>
-                <w:szCs w:val="20"/>
-              </w:rPr>
-              <w:t>Facilitates user account creation and role selection for new users. Addresses the stakeholder need for onboarding students and employers securely into the platform.</w:t>
+                <w:sz w:val="22"/>
+              </w:rPr>
+            </w:pPr>
+            <w:r>
+              <w:rPr>
+                <w:rFonts w:ascii="Arial" w:hAnsi="Arial" w:cs="Arial"/>
+                <w:sz w:val="22"/>
+              </w:rPr>
+              <w:t>Facilitates user account creation and role selection for new users</w:t>
+            </w:r>
+            <w:r>
+              <w:rPr>
+                <w:rFonts w:ascii="Arial" w:hAnsi="Arial" w:cs="Arial"/>
+                <w:sz w:val="22"/>
+              </w:rPr>
+              <w:t>.</w:t>
             </w:r>
           </w:p>
         </w:tc>
@@ -188,13 +192,13 @@
                 <w:rFonts w:ascii="Arial" w:hAnsi="Arial" w:cs="Arial"/>
                 <w:b w:val="0"/>
                 <w:bCs w:val="0"/>
+                <w:sz w:val="22"/>
               </w:rPr>
             </w:pPr>
             <w:r>
               <w:rPr>
                 <w:rFonts w:ascii="Arial" w:eastAsia="Times New Roman" w:hAnsi="Arial" w:cs="Arial"/>
-                <w:sz w:val="20"/>
-                <w:szCs w:val="22"/>
+                <w:sz w:val="22"/>
               </w:rPr>
               <w:t>Description</w:t>
             </w:r>
@@ -209,17 +213,22 @@
               <w:cnfStyle w:val="000000100000" w:firstRow="0" w:lastRow="0" w:firstColumn="0" w:lastColumn="0" w:oddVBand="0" w:evenVBand="0" w:oddHBand="1" w:evenHBand="0" w:firstRowFirstColumn="0" w:firstRowLastColumn="0" w:lastRowFirstColumn="0" w:lastRowLastColumn="0"/>
               <w:rPr>
                 <w:rFonts w:ascii="Arial" w:hAnsi="Arial" w:cs="Arial"/>
-                <w:sz w:val="20"/>
-                <w:szCs w:val="20"/>
-              </w:rPr>
-            </w:pPr>
-            <w:r>
-              <w:rPr>
-                <w:rFonts w:ascii="Arial" w:hAnsi="Arial" w:cs="Arial"/>
-                <w:sz w:val="20"/>
-                <w:szCs w:val="20"/>
-              </w:rPr>
-              <w:t>Displays a registration form allowing a user to select their role and establish account credentials. Includes real-time validation of password security requirements.</w:t>
+                <w:sz w:val="22"/>
+              </w:rPr>
+            </w:pPr>
+            <w:r>
+              <w:rPr>
+                <w:rFonts w:ascii="Arial" w:hAnsi="Arial" w:cs="Arial"/>
+                <w:sz w:val="22"/>
+              </w:rPr>
+              <w:t>Displays a registration form allowing a user to select their role and establish account credentials</w:t>
+            </w:r>
+            <w:r>
+              <w:rPr>
+                <w:rFonts w:ascii="Arial" w:hAnsi="Arial" w:cs="Arial"/>
+                <w:sz w:val="22"/>
+              </w:rPr>
+              <w:t>.</w:t>
             </w:r>
           </w:p>
         </w:tc>
@@ -236,13 +245,13 @@
                 <w:rFonts w:ascii="Arial" w:hAnsi="Arial" w:cs="Arial"/>
                 <w:b w:val="0"/>
                 <w:bCs w:val="0"/>
+                <w:sz w:val="22"/>
               </w:rPr>
             </w:pPr>
             <w:r>
               <w:rPr>
                 <w:rFonts w:ascii="Arial" w:eastAsia="Times New Roman" w:hAnsi="Arial" w:cs="Arial"/>
-                <w:sz w:val="20"/>
-                <w:szCs w:val="22"/>
+                <w:sz w:val="22"/>
               </w:rPr>
               <w:t>Requirements</w:t>
             </w:r>
@@ -257,28 +266,44 @@
               <w:cnfStyle w:val="000000000000" w:firstRow="0" w:lastRow="0" w:firstColumn="0" w:lastColumn="0" w:oddVBand="0" w:evenVBand="0" w:oddHBand="0" w:evenHBand="0" w:firstRowFirstColumn="0" w:firstRowLastColumn="0" w:lastRowFirstColumn="0" w:lastRowLastColumn="0"/>
               <w:rPr>
                 <w:rFonts w:ascii="Arial" w:hAnsi="Arial" w:cs="Arial"/>
-                <w:sz w:val="20"/>
-                <w:szCs w:val="20"/>
-              </w:rPr>
-            </w:pPr>
-            <w:r>
-              <w:rPr>
-                <w:rFonts w:ascii="Arial" w:hAnsi="Arial" w:cs="Arial"/>
-                <w:sz w:val="20"/>
-                <w:szCs w:val="20"/>
-              </w:rPr>
-              <w:t xml:space="preserve">User account creation and role selection requirements supporting student and company access throughout Sections 2.x and </w:t>
-            </w:r>
-            <w:proofErr w:type="gramStart"/>
-            <w:r>
-              <w:rPr>
-                <w:rFonts w:ascii="Arial" w:hAnsi="Arial" w:cs="Arial"/>
-                <w:sz w:val="20"/>
-                <w:szCs w:val="20"/>
-              </w:rPr>
-              <w:t>3.x.</w:t>
-            </w:r>
-            <w:proofErr w:type="gramEnd"/>
+                <w:sz w:val="22"/>
+              </w:rPr>
+            </w:pPr>
+            <w:r>
+              <w:rPr>
+                <w:rFonts w:ascii="Arial" w:hAnsi="Arial" w:cs="Arial"/>
+                <w:sz w:val="22"/>
+              </w:rPr>
+              <w:t xml:space="preserve">SRS </w:t>
+            </w:r>
+            <w:r>
+              <w:rPr>
+                <w:rFonts w:ascii="Arial" w:hAnsi="Arial" w:cs="Arial"/>
+                <w:sz w:val="22"/>
+              </w:rPr>
+              <w:t>2.</w:t>
+            </w:r>
+            <w:r>
+              <w:rPr>
+                <w:rFonts w:ascii="Arial" w:hAnsi="Arial" w:cs="Arial"/>
+                <w:sz w:val="22"/>
+              </w:rPr>
+              <w:t xml:space="preserve">1 Company Profile Page, </w:t>
+            </w:r>
+            <w:r>
+              <w:rPr>
+                <w:rFonts w:ascii="Arial" w:hAnsi="Arial" w:cs="Arial"/>
+                <w:sz w:val="22"/>
+              </w:rPr>
+              <w:t>3.</w:t>
+            </w:r>
+            <w:r>
+              <w:rPr>
+                <w:rFonts w:ascii="Arial" w:hAnsi="Arial" w:cs="Arial"/>
+                <w:sz w:val="22"/>
+              </w:rPr>
+              <w:t>1 Student User Profile</w:t>
+            </w:r>
           </w:p>
         </w:tc>
       </w:tr>
@@ -298,13 +323,13 @@
                 <w:rFonts w:ascii="Arial" w:hAnsi="Arial" w:cs="Arial"/>
                 <w:b w:val="0"/>
                 <w:bCs w:val="0"/>
+                <w:sz w:val="22"/>
               </w:rPr>
             </w:pPr>
             <w:r>
               <w:rPr>
                 <w:rFonts w:ascii="Arial" w:eastAsia="Times New Roman" w:hAnsi="Arial" w:cs="Arial"/>
-                <w:sz w:val="20"/>
-                <w:szCs w:val="22"/>
+                <w:sz w:val="22"/>
               </w:rPr>
               <w:t>Elements</w:t>
             </w:r>
@@ -319,73 +344,15 @@
               <w:cnfStyle w:val="000000100000" w:firstRow="0" w:lastRow="0" w:firstColumn="0" w:lastColumn="0" w:oddVBand="0" w:evenVBand="0" w:oddHBand="1" w:evenHBand="0" w:firstRowFirstColumn="0" w:firstRowLastColumn="0" w:lastRowFirstColumn="0" w:lastRowLastColumn="0"/>
               <w:rPr>
                 <w:rFonts w:ascii="Arial" w:hAnsi="Arial" w:cs="Arial"/>
-                <w:sz w:val="20"/>
-                <w:szCs w:val="20"/>
-              </w:rPr>
-            </w:pPr>
-            <w:r>
-              <w:rPr>
-                <w:rFonts w:ascii="Arial" w:hAnsi="Arial" w:cs="Arial"/>
-                <w:b/>
-                <w:bCs/>
-                <w:sz w:val="20"/>
-                <w:szCs w:val="20"/>
-              </w:rPr>
-              <w:t xml:space="preserve">Back to Login </w:t>
-            </w:r>
-            <w:proofErr w:type="gramStart"/>
-            <w:r>
-              <w:rPr>
-                <w:rFonts w:ascii="Arial" w:hAnsi="Arial" w:cs="Arial"/>
-                <w:b/>
-                <w:bCs/>
-                <w:sz w:val="20"/>
-                <w:szCs w:val="20"/>
-              </w:rPr>
-              <w:t>button</w:t>
-            </w:r>
-            <w:r>
-              <w:rPr>
-                <w:rFonts w:ascii="Arial" w:hAnsi="Arial" w:cs="Arial"/>
-                <w:b/>
-                <w:bCs/>
-                <w:sz w:val="20"/>
-                <w:szCs w:val="20"/>
-              </w:rPr>
-              <w:t xml:space="preserve"> </w:t>
-            </w:r>
-            <w:r>
-              <w:rPr>
-                <w:rFonts w:ascii="Arial" w:hAnsi="Arial" w:cs="Arial"/>
-                <w:sz w:val="20"/>
-                <w:szCs w:val="20"/>
-              </w:rPr>
-              <w:t>:</w:t>
-            </w:r>
-            <w:proofErr w:type="gramEnd"/>
-            <w:r>
-              <w:rPr>
-                <w:rFonts w:ascii="Arial" w:hAnsi="Arial" w:cs="Arial"/>
-                <w:sz w:val="20"/>
-                <w:szCs w:val="20"/>
-              </w:rPr>
-              <w:t xml:space="preserve"> a</w:t>
-            </w:r>
-            <w:r>
-              <w:rPr>
-                <w:rFonts w:ascii="Arial" w:hAnsi="Arial" w:cs="Arial"/>
-                <w:sz w:val="20"/>
-                <w:szCs w:val="20"/>
-              </w:rPr>
-              <w:t xml:space="preserve"> navigational control that allows the user to abandon the registration process and return directly to the primary authentication screen</w:t>
-            </w:r>
-            <w:r>
-              <w:rPr>
-                <w:rFonts w:ascii="Arial" w:hAnsi="Arial" w:cs="Arial"/>
-                <w:sz w:val="20"/>
-                <w:szCs w:val="20"/>
-              </w:rPr>
-              <w:t>.</w:t>
+                <w:sz w:val="22"/>
+              </w:rPr>
+            </w:pPr>
+            <w:r>
+              <w:rPr>
+                <w:rFonts w:ascii="Arial" w:hAnsi="Arial" w:cs="Arial"/>
+                <w:sz w:val="22"/>
+              </w:rPr>
+              <w:t>Back to Login button</w:t>
             </w:r>
           </w:p>
         </w:tc>
@@ -401,8 +368,7 @@
             <w:pPr>
               <w:rPr>
                 <w:rFonts w:ascii="Arial" w:eastAsia="Times New Roman" w:hAnsi="Arial" w:cs="Arial"/>
-                <w:sz w:val="20"/>
-                <w:szCs w:val="22"/>
+                <w:sz w:val="22"/>
               </w:rPr>
             </w:pPr>
           </w:p>
@@ -417,73 +383,15 @@
               <w:cnfStyle w:val="000000000000" w:firstRow="0" w:lastRow="0" w:firstColumn="0" w:lastColumn="0" w:oddVBand="0" w:evenVBand="0" w:oddHBand="0" w:evenHBand="0" w:firstRowFirstColumn="0" w:firstRowLastColumn="0" w:lastRowFirstColumn="0" w:lastRowLastColumn="0"/>
               <w:rPr>
                 <w:rFonts w:ascii="Arial" w:hAnsi="Arial" w:cs="Arial"/>
-                <w:sz w:val="20"/>
-                <w:szCs w:val="20"/>
-              </w:rPr>
-            </w:pPr>
-            <w:r>
-              <w:rPr>
-                <w:rFonts w:ascii="Arial" w:hAnsi="Arial" w:cs="Arial"/>
-                <w:b/>
-                <w:bCs/>
-                <w:sz w:val="20"/>
-                <w:szCs w:val="20"/>
-              </w:rPr>
-              <w:t xml:space="preserve">Student / Employer role selection </w:t>
-            </w:r>
-            <w:proofErr w:type="gramStart"/>
-            <w:r>
-              <w:rPr>
-                <w:rFonts w:ascii="Arial" w:hAnsi="Arial" w:cs="Arial"/>
-                <w:b/>
-                <w:bCs/>
-                <w:sz w:val="20"/>
-                <w:szCs w:val="20"/>
-              </w:rPr>
-              <w:t>dropdown</w:t>
-            </w:r>
-            <w:r>
-              <w:rPr>
-                <w:rFonts w:ascii="Arial" w:hAnsi="Arial" w:cs="Arial"/>
-                <w:b/>
-                <w:bCs/>
-                <w:sz w:val="20"/>
-                <w:szCs w:val="20"/>
-              </w:rPr>
-              <w:t xml:space="preserve"> </w:t>
-            </w:r>
-            <w:r>
-              <w:rPr>
-                <w:rFonts w:ascii="Arial" w:hAnsi="Arial" w:cs="Arial"/>
-                <w:sz w:val="20"/>
-                <w:szCs w:val="20"/>
-              </w:rPr>
-              <w:t>:</w:t>
-            </w:r>
-            <w:proofErr w:type="gramEnd"/>
-            <w:r>
-              <w:rPr>
-                <w:rFonts w:ascii="Arial" w:hAnsi="Arial" w:cs="Arial"/>
-                <w:sz w:val="20"/>
-                <w:szCs w:val="20"/>
-              </w:rPr>
-              <w:t xml:space="preserve"> a</w:t>
-            </w:r>
-            <w:r>
-              <w:rPr>
-                <w:rFonts w:ascii="Arial" w:hAnsi="Arial" w:cs="Arial"/>
-                <w:sz w:val="20"/>
-                <w:szCs w:val="20"/>
-              </w:rPr>
-              <w:t>n input control that determines the user's account type</w:t>
-            </w:r>
-            <w:r>
-              <w:rPr>
-                <w:rFonts w:ascii="Arial" w:hAnsi="Arial" w:cs="Arial"/>
-                <w:sz w:val="20"/>
-                <w:szCs w:val="20"/>
-              </w:rPr>
-              <w:t>.</w:t>
+                <w:sz w:val="22"/>
+              </w:rPr>
+            </w:pPr>
+            <w:r>
+              <w:rPr>
+                <w:rFonts w:ascii="Arial" w:hAnsi="Arial" w:cs="Arial"/>
+                <w:sz w:val="22"/>
+              </w:rPr>
+              <w:t>Student / Employer role selection dropdown</w:t>
             </w:r>
           </w:p>
         </w:tc>
@@ -502,8 +410,7 @@
             <w:pPr>
               <w:rPr>
                 <w:rFonts w:ascii="Arial" w:eastAsia="Times New Roman" w:hAnsi="Arial" w:cs="Arial"/>
-                <w:sz w:val="20"/>
-                <w:szCs w:val="22"/>
+                <w:sz w:val="22"/>
               </w:rPr>
             </w:pPr>
           </w:p>
@@ -517,113 +424,22 @@
               <w:cnfStyle w:val="000000100000" w:firstRow="0" w:lastRow="0" w:firstColumn="0" w:lastColumn="0" w:oddVBand="0" w:evenVBand="0" w:oddHBand="1" w:evenHBand="0" w:firstRowFirstColumn="0" w:firstRowLastColumn="0" w:lastRowFirstColumn="0" w:lastRowLastColumn="0"/>
               <w:rPr>
                 <w:rFonts w:ascii="Arial" w:hAnsi="Arial" w:cs="Arial"/>
-                <w:sz w:val="20"/>
-                <w:szCs w:val="20"/>
-              </w:rPr>
-            </w:pPr>
-            <w:r>
-              <w:rPr>
-                <w:rFonts w:ascii="Arial" w:hAnsi="Arial" w:cs="Arial"/>
-                <w:b/>
-                <w:bCs/>
-                <w:sz w:val="20"/>
-                <w:szCs w:val="20"/>
-              </w:rPr>
-              <w:t xml:space="preserve">Text </w:t>
-            </w:r>
-            <w:proofErr w:type="gramStart"/>
-            <w:r>
-              <w:rPr>
-                <w:rFonts w:ascii="Arial" w:hAnsi="Arial" w:cs="Arial"/>
-                <w:b/>
-                <w:bCs/>
-                <w:sz w:val="20"/>
-                <w:szCs w:val="20"/>
-              </w:rPr>
-              <w:t>fields</w:t>
-            </w:r>
-            <w:r>
-              <w:rPr>
-                <w:rFonts w:ascii="Arial" w:hAnsi="Arial" w:cs="Arial"/>
-                <w:b/>
-                <w:bCs/>
-                <w:sz w:val="20"/>
-                <w:szCs w:val="20"/>
-              </w:rPr>
-              <w:t xml:space="preserve"> </w:t>
-            </w:r>
-            <w:r>
-              <w:rPr>
-                <w:rFonts w:ascii="Arial" w:hAnsi="Arial" w:cs="Arial"/>
-                <w:sz w:val="20"/>
-                <w:szCs w:val="20"/>
-              </w:rPr>
-              <w:t>:</w:t>
-            </w:r>
-            <w:proofErr w:type="gramEnd"/>
-            <w:r>
-              <w:rPr>
-                <w:rFonts w:ascii="Arial" w:hAnsi="Arial" w:cs="Arial"/>
-                <w:sz w:val="20"/>
-                <w:szCs w:val="20"/>
-              </w:rPr>
-              <w:t xml:space="preserve"> </w:t>
-            </w:r>
-            <w:r>
-              <w:rPr>
-                <w:rFonts w:ascii="Arial" w:hAnsi="Arial" w:cs="Arial"/>
-                <w:sz w:val="20"/>
-                <w:szCs w:val="20"/>
+                <w:sz w:val="22"/>
+              </w:rPr>
+            </w:pPr>
+            <w:r>
+              <w:rPr>
+                <w:rFonts w:ascii="Arial" w:hAnsi="Arial" w:cs="Arial"/>
+                <w:sz w:val="22"/>
+              </w:rPr>
+              <w:t>Text field</w:t>
+            </w:r>
+            <w:r>
+              <w:rPr>
+                <w:rFonts w:ascii="Arial" w:hAnsi="Arial" w:cs="Arial"/>
+                <w:sz w:val="22"/>
               </w:rPr>
               <w:t>s</w:t>
-            </w:r>
-            <w:r>
-              <w:rPr>
-                <w:rFonts w:ascii="Arial" w:hAnsi="Arial" w:cs="Arial"/>
-                <w:sz w:val="20"/>
-                <w:szCs w:val="20"/>
-              </w:rPr>
-              <w:t>tandard input controls capturing the user's personal identification and secure authentication credentials</w:t>
-            </w:r>
-            <w:r>
-              <w:rPr>
-                <w:rFonts w:ascii="Arial" w:hAnsi="Arial" w:cs="Arial"/>
-                <w:sz w:val="20"/>
-                <w:szCs w:val="20"/>
-              </w:rPr>
-              <w:t xml:space="preserve">, featuring </w:t>
-            </w:r>
-            <w:r>
-              <w:rPr>
-                <w:rFonts w:ascii="Arial" w:hAnsi="Arial" w:cs="Arial"/>
-                <w:sz w:val="20"/>
-                <w:szCs w:val="20"/>
-              </w:rPr>
-              <w:t xml:space="preserve">First Name, Last Name, Email, Password, </w:t>
-            </w:r>
-            <w:r>
-              <w:rPr>
-                <w:rFonts w:ascii="Arial" w:hAnsi="Arial" w:cs="Arial"/>
-                <w:sz w:val="20"/>
-                <w:szCs w:val="20"/>
-              </w:rPr>
-              <w:t xml:space="preserve">and </w:t>
-            </w:r>
-            <w:r>
-              <w:rPr>
-                <w:rFonts w:ascii="Arial" w:hAnsi="Arial" w:cs="Arial"/>
-                <w:sz w:val="20"/>
-                <w:szCs w:val="20"/>
-              </w:rPr>
-              <w:t>Confirm Password</w:t>
-            </w:r>
-            <w:r>
-              <w:rPr>
-                <w:rFonts w:ascii="Arial" w:hAnsi="Arial" w:cs="Arial"/>
-                <w:sz w:val="20"/>
-                <w:szCs w:val="20"/>
-              </w:rPr>
-              <w:t>.</w:t>
             </w:r>
           </w:p>
         </w:tc>
@@ -642,8 +458,7 @@
             <w:pPr>
               <w:rPr>
                 <w:rFonts w:ascii="Arial" w:eastAsia="Times New Roman" w:hAnsi="Arial" w:cs="Arial"/>
-                <w:sz w:val="20"/>
-                <w:szCs w:val="22"/>
+                <w:sz w:val="22"/>
               </w:rPr>
             </w:pPr>
           </w:p>
@@ -658,81 +473,15 @@
               <w:cnfStyle w:val="000000000000" w:firstRow="0" w:lastRow="0" w:firstColumn="0" w:lastColumn="0" w:oddVBand="0" w:evenVBand="0" w:oddHBand="0" w:evenHBand="0" w:firstRowFirstColumn="0" w:firstRowLastColumn="0" w:lastRowFirstColumn="0" w:lastRowLastColumn="0"/>
               <w:rPr>
                 <w:rFonts w:ascii="Arial" w:hAnsi="Arial" w:cs="Arial"/>
-                <w:sz w:val="20"/>
-                <w:szCs w:val="20"/>
-              </w:rPr>
-            </w:pPr>
-            <w:r>
-              <w:rPr>
-                <w:rFonts w:ascii="Arial" w:hAnsi="Arial" w:cs="Arial"/>
-                <w:b/>
-                <w:bCs/>
-                <w:sz w:val="20"/>
-                <w:szCs w:val="20"/>
-              </w:rPr>
-              <w:t xml:space="preserve">Password validation </w:t>
-            </w:r>
-            <w:proofErr w:type="gramStart"/>
-            <w:r>
-              <w:rPr>
-                <w:rFonts w:ascii="Arial" w:hAnsi="Arial" w:cs="Arial"/>
-                <w:b/>
-                <w:bCs/>
-                <w:sz w:val="20"/>
-                <w:szCs w:val="20"/>
-              </w:rPr>
-              <w:t>checklist</w:t>
-            </w:r>
-            <w:r>
-              <w:rPr>
-                <w:rFonts w:ascii="Arial" w:hAnsi="Arial" w:cs="Arial"/>
-                <w:b/>
-                <w:bCs/>
-                <w:sz w:val="20"/>
-                <w:szCs w:val="20"/>
-              </w:rPr>
-              <w:t xml:space="preserve"> </w:t>
-            </w:r>
-            <w:r>
-              <w:rPr>
-                <w:rFonts w:ascii="Arial" w:hAnsi="Arial" w:cs="Arial"/>
-                <w:sz w:val="20"/>
-                <w:szCs w:val="20"/>
-              </w:rPr>
-              <w:t>:</w:t>
-            </w:r>
-            <w:proofErr w:type="gramEnd"/>
-            <w:r>
-              <w:rPr>
-                <w:rFonts w:ascii="Arial" w:hAnsi="Arial" w:cs="Arial"/>
-                <w:sz w:val="20"/>
-                <w:szCs w:val="20"/>
-              </w:rPr>
-              <w:t xml:space="preserve"> </w:t>
-            </w:r>
-            <w:r>
-              <w:rPr>
-                <w:rFonts w:ascii="Arial" w:hAnsi="Arial" w:cs="Arial"/>
-                <w:sz w:val="20"/>
-                <w:szCs w:val="20"/>
-              </w:rPr>
-              <w:t>a</w:t>
-            </w:r>
-            <w:r>
-              <w:rPr>
-                <w:rFonts w:ascii="Arial" w:hAnsi="Arial" w:cs="Arial"/>
-                <w:sz w:val="20"/>
-                <w:szCs w:val="20"/>
-              </w:rPr>
-              <w:t xml:space="preserve"> real-time visual indicator that evaluates the user's entered password against system security requirements</w:t>
-            </w:r>
-            <w:r>
-              <w:rPr>
-                <w:rFonts w:ascii="Arial" w:hAnsi="Arial" w:cs="Arial"/>
-                <w:sz w:val="20"/>
-                <w:szCs w:val="20"/>
-              </w:rPr>
-              <w:t>.</w:t>
+                <w:sz w:val="22"/>
+              </w:rPr>
+            </w:pPr>
+            <w:r>
+              <w:rPr>
+                <w:rFonts w:ascii="Arial" w:hAnsi="Arial" w:cs="Arial"/>
+                <w:sz w:val="22"/>
+              </w:rPr>
+              <w:t>Password validation checklist</w:t>
             </w:r>
           </w:p>
         </w:tc>
@@ -751,8 +500,7 @@
             <w:pPr>
               <w:rPr>
                 <w:rFonts w:ascii="Arial" w:eastAsia="Times New Roman" w:hAnsi="Arial" w:cs="Arial"/>
-                <w:sz w:val="20"/>
-                <w:szCs w:val="22"/>
+                <w:sz w:val="22"/>
               </w:rPr>
             </w:pPr>
           </w:p>
@@ -766,75 +514,15 @@
               <w:cnfStyle w:val="000000100000" w:firstRow="0" w:lastRow="0" w:firstColumn="0" w:lastColumn="0" w:oddVBand="0" w:evenVBand="0" w:oddHBand="1" w:evenHBand="0" w:firstRowFirstColumn="0" w:firstRowLastColumn="0" w:lastRowFirstColumn="0" w:lastRowLastColumn="0"/>
               <w:rPr>
                 <w:rFonts w:ascii="Arial" w:hAnsi="Arial" w:cs="Arial"/>
-                <w:b/>
-                <w:bCs/>
-                <w:sz w:val="20"/>
-                <w:szCs w:val="20"/>
-              </w:rPr>
-            </w:pPr>
-            <w:r>
-              <w:rPr>
-                <w:rFonts w:ascii="Arial" w:hAnsi="Arial" w:cs="Arial"/>
-                <w:b/>
-                <w:bCs/>
-                <w:sz w:val="20"/>
-                <w:szCs w:val="20"/>
-              </w:rPr>
-              <w:t xml:space="preserve">Submit </w:t>
-            </w:r>
-            <w:proofErr w:type="gramStart"/>
-            <w:r>
-              <w:rPr>
-                <w:rFonts w:ascii="Arial" w:hAnsi="Arial" w:cs="Arial"/>
-                <w:b/>
-                <w:bCs/>
-                <w:sz w:val="20"/>
-                <w:szCs w:val="20"/>
-              </w:rPr>
-              <w:t>button</w:t>
-            </w:r>
-            <w:r>
-              <w:rPr>
-                <w:rFonts w:ascii="Arial" w:hAnsi="Arial" w:cs="Arial"/>
-                <w:b/>
-                <w:bCs/>
-                <w:sz w:val="20"/>
-                <w:szCs w:val="20"/>
-              </w:rPr>
-              <w:t xml:space="preserve"> </w:t>
-            </w:r>
-            <w:r>
-              <w:rPr>
-                <w:rFonts w:ascii="Arial" w:hAnsi="Arial" w:cs="Arial"/>
-                <w:sz w:val="20"/>
-                <w:szCs w:val="20"/>
-              </w:rPr>
-              <w:t>:</w:t>
-            </w:r>
-            <w:proofErr w:type="gramEnd"/>
-            <w:r>
-              <w:rPr>
-                <w:rFonts w:ascii="Arial" w:hAnsi="Arial" w:cs="Arial"/>
-                <w:sz w:val="20"/>
-                <w:szCs w:val="20"/>
-              </w:rPr>
-              <w:t xml:space="preserve"> t</w:t>
-            </w:r>
-            <w:r>
-              <w:rPr>
-                <w:rFonts w:ascii="Arial" w:hAnsi="Arial" w:cs="Arial"/>
-                <w:sz w:val="20"/>
-                <w:szCs w:val="20"/>
-              </w:rPr>
-              <w:t>riggers the form submission event</w:t>
-            </w:r>
-            <w:r>
-              <w:rPr>
-                <w:rFonts w:ascii="Arial" w:hAnsi="Arial" w:cs="Arial"/>
-                <w:sz w:val="20"/>
-                <w:szCs w:val="20"/>
-              </w:rPr>
-              <w:t>.</w:t>
+                <w:sz w:val="22"/>
+              </w:rPr>
+            </w:pPr>
+            <w:r>
+              <w:rPr>
+                <w:rFonts w:ascii="Arial" w:hAnsi="Arial" w:cs="Arial"/>
+                <w:sz w:val="22"/>
+              </w:rPr>
+              <w:t>Submit button</w:t>
             </w:r>
           </w:p>
         </w:tc>
@@ -851,13 +539,13 @@
                 <w:rFonts w:ascii="Arial" w:hAnsi="Arial" w:cs="Arial"/>
                 <w:b w:val="0"/>
                 <w:bCs w:val="0"/>
+                <w:sz w:val="22"/>
               </w:rPr>
             </w:pPr>
             <w:r>
               <w:rPr>
                 <w:rFonts w:ascii="Arial" w:eastAsia="Times New Roman" w:hAnsi="Arial" w:cs="Arial"/>
-                <w:sz w:val="20"/>
-                <w:szCs w:val="22"/>
+                <w:sz w:val="22"/>
               </w:rPr>
               <w:t>Inputs</w:t>
             </w:r>
@@ -872,17 +560,29 @@
               <w:cnfStyle w:val="000000000000" w:firstRow="0" w:lastRow="0" w:firstColumn="0" w:lastColumn="0" w:oddVBand="0" w:evenVBand="0" w:oddHBand="0" w:evenHBand="0" w:firstRowFirstColumn="0" w:firstRowLastColumn="0" w:lastRowFirstColumn="0" w:lastRowLastColumn="0"/>
               <w:rPr>
                 <w:rFonts w:ascii="Arial" w:hAnsi="Arial" w:cs="Arial"/>
-                <w:sz w:val="20"/>
-                <w:szCs w:val="20"/>
-              </w:rPr>
-            </w:pPr>
-            <w:r>
-              <w:rPr>
-                <w:rFonts w:ascii="Arial" w:hAnsi="Arial" w:cs="Arial"/>
-                <w:sz w:val="20"/>
-                <w:szCs w:val="20"/>
-              </w:rPr>
-              <w:t>Role selection (Student or Employer), First Name string, Last Name string, Email string, Password string, Confirm Password string, and Submit action.</w:t>
+                <w:sz w:val="22"/>
+              </w:rPr>
+            </w:pPr>
+            <w:r>
+              <w:rPr>
+                <w:rFonts w:ascii="Arial" w:hAnsi="Arial" w:cs="Arial"/>
+                <w:sz w:val="22"/>
+              </w:rPr>
+              <w:t>Role selection</w:t>
+            </w:r>
+            <w:r>
+              <w:rPr>
+                <w:rFonts w:ascii="Arial" w:hAnsi="Arial" w:cs="Arial"/>
+                <w:sz w:val="22"/>
+              </w:rPr>
+              <w:t xml:space="preserve">, </w:t>
+            </w:r>
+            <w:r>
+              <w:rPr>
+                <w:rFonts w:ascii="Arial" w:hAnsi="Arial" w:cs="Arial"/>
+                <w:sz w:val="22"/>
+              </w:rPr>
+              <w:t>First Name string, Last Name string, Email string, Password string, Confirm Password string, Submit action.</w:t>
             </w:r>
           </w:p>
         </w:tc>
@@ -902,13 +602,13 @@
                 <w:rFonts w:ascii="Arial" w:hAnsi="Arial" w:cs="Arial"/>
                 <w:b w:val="0"/>
                 <w:bCs w:val="0"/>
+                <w:sz w:val="22"/>
               </w:rPr>
             </w:pPr>
             <w:r>
               <w:rPr>
                 <w:rFonts w:ascii="Arial" w:eastAsia="Times New Roman" w:hAnsi="Arial" w:cs="Arial"/>
-                <w:sz w:val="20"/>
-                <w:szCs w:val="22"/>
+                <w:sz w:val="22"/>
               </w:rPr>
               <w:t>Outputs</w:t>
             </w:r>
@@ -923,15 +623,13 @@
               <w:cnfStyle w:val="000000100000" w:firstRow="0" w:lastRow="0" w:firstColumn="0" w:lastColumn="0" w:oddVBand="0" w:evenVBand="0" w:oddHBand="1" w:evenHBand="0" w:firstRowFirstColumn="0" w:firstRowLastColumn="0" w:lastRowFirstColumn="0" w:lastRowLastColumn="0"/>
               <w:rPr>
                 <w:rFonts w:ascii="Arial" w:hAnsi="Arial" w:cs="Arial"/>
-                <w:sz w:val="20"/>
-                <w:szCs w:val="20"/>
-              </w:rPr>
-            </w:pPr>
-            <w:r>
-              <w:rPr>
-                <w:rFonts w:ascii="Arial" w:hAnsi="Arial" w:cs="Arial"/>
-                <w:sz w:val="20"/>
-                <w:szCs w:val="20"/>
+                <w:sz w:val="22"/>
+              </w:rPr>
+            </w:pPr>
+            <w:r>
+              <w:rPr>
+                <w:rFonts w:ascii="Arial" w:hAnsi="Arial" w:cs="Arial"/>
+                <w:sz w:val="22"/>
               </w:rPr>
               <w:t>Visual feedback on password requirement validation (status icons for "8 characters long", "Includes capital letter", and "Includes special character").</w:t>
             </w:r>
@@ -950,13 +648,13 @@
                 <w:rFonts w:ascii="Arial" w:hAnsi="Arial" w:cs="Arial"/>
                 <w:b w:val="0"/>
                 <w:bCs w:val="0"/>
+                <w:sz w:val="22"/>
               </w:rPr>
             </w:pPr>
             <w:r>
               <w:rPr>
                 <w:rFonts w:ascii="Arial" w:eastAsia="Times New Roman" w:hAnsi="Arial" w:cs="Arial"/>
-                <w:sz w:val="20"/>
-                <w:szCs w:val="22"/>
+                <w:sz w:val="22"/>
               </w:rPr>
               <w:t>Navigation / References</w:t>
             </w:r>
@@ -971,23 +669,20 @@
               <w:cnfStyle w:val="000000000000" w:firstRow="0" w:lastRow="0" w:firstColumn="0" w:lastColumn="0" w:oddVBand="0" w:evenVBand="0" w:oddHBand="0" w:evenHBand="0" w:firstRowFirstColumn="0" w:firstRowLastColumn="0" w:lastRowFirstColumn="0" w:lastRowLastColumn="0"/>
               <w:rPr>
                 <w:rFonts w:ascii="Arial" w:hAnsi="Arial" w:cs="Arial"/>
-                <w:sz w:val="20"/>
-                <w:szCs w:val="20"/>
-              </w:rPr>
-            </w:pPr>
-            <w:r>
-              <w:rPr>
-                <w:rFonts w:ascii="Arial" w:hAnsi="Arial" w:cs="Arial"/>
-                <w:sz w:val="20"/>
-                <w:szCs w:val="20"/>
+                <w:sz w:val="22"/>
+              </w:rPr>
+            </w:pPr>
+            <w:r>
+              <w:rPr>
+                <w:rFonts w:ascii="Arial" w:hAnsi="Arial" w:cs="Arial"/>
+                <w:sz w:val="22"/>
               </w:rPr>
               <w:t>1.1 Login / Logout (accessed via "Back to Login" button)</w:t>
             </w:r>
             <w:r>
               <w:rPr>
                 <w:rFonts w:ascii="Arial" w:hAnsi="Arial" w:cs="Arial"/>
-                <w:sz w:val="20"/>
-                <w:szCs w:val="20"/>
+                <w:sz w:val="22"/>
               </w:rPr>
               <w:t>.</w:t>
             </w:r>
@@ -997,17 +692,29 @@
               <w:cnfStyle w:val="000000000000" w:firstRow="0" w:lastRow="0" w:firstColumn="0" w:lastColumn="0" w:oddVBand="0" w:evenVBand="0" w:oddHBand="0" w:evenHBand="0" w:firstRowFirstColumn="0" w:firstRowLastColumn="0" w:lastRowFirstColumn="0" w:lastRowLastColumn="0"/>
               <w:rPr>
                 <w:rFonts w:ascii="Arial" w:hAnsi="Arial" w:cs="Arial"/>
-                <w:sz w:val="20"/>
-                <w:szCs w:val="20"/>
-              </w:rPr>
-            </w:pPr>
-            <w:r>
-              <w:rPr>
-                <w:rFonts w:ascii="Arial" w:hAnsi="Arial" w:cs="Arial"/>
-                <w:sz w:val="20"/>
-                <w:szCs w:val="20"/>
-              </w:rPr>
-              <w:t>2.1 Student Dashboard or 3.1 Company Dashboard upon successful submission.</w:t>
+                <w:sz w:val="22"/>
+              </w:rPr>
+            </w:pPr>
+            <w:r>
+              <w:rPr>
+                <w:rFonts w:ascii="Arial" w:hAnsi="Arial" w:cs="Arial"/>
+                <w:sz w:val="22"/>
+              </w:rPr>
+              <w:t>2.1 Student Dashboard</w:t>
+            </w:r>
+            <w:r>
+              <w:rPr>
+                <w:rFonts w:ascii="Arial" w:hAnsi="Arial" w:cs="Arial"/>
+                <w:sz w:val="22"/>
+              </w:rPr>
+              <w:t xml:space="preserve"> or </w:t>
+            </w:r>
+            <w:r>
+              <w:rPr>
+                <w:rFonts w:ascii="Arial" w:hAnsi="Arial" w:cs="Arial"/>
+                <w:sz w:val="22"/>
+              </w:rPr>
+              <w:t>3.1 Company Dashboard upon successful submission.</w:t>
             </w:r>
           </w:p>
         </w:tc>
@@ -1015,6 +722,7 @@
       <w:tr>
         <w:trPr>
           <w:cnfStyle w:val="000000100000" w:firstRow="0" w:lastRow="0" w:firstColumn="0" w:lastColumn="0" w:oddVBand="0" w:evenVBand="0" w:oddHBand="1" w:evenHBand="0" w:firstRowFirstColumn="0" w:firstRowLastColumn="0" w:lastRowFirstColumn="0" w:lastRowLastColumn="0"/>
+          <w:trHeight w:val="70"/>
         </w:trPr>
         <w:tc>
           <w:tcPr>
@@ -1027,13 +735,13 @@
                 <w:rFonts w:ascii="Arial" w:hAnsi="Arial" w:cs="Arial"/>
                 <w:b w:val="0"/>
                 <w:bCs w:val="0"/>
+                <w:sz w:val="22"/>
               </w:rPr>
             </w:pPr>
             <w:r>
               <w:rPr>
                 <w:rFonts w:ascii="Arial" w:eastAsia="Times New Roman" w:hAnsi="Arial" w:cs="Arial"/>
-                <w:sz w:val="20"/>
-                <w:szCs w:val="22"/>
+                <w:sz w:val="22"/>
               </w:rPr>
               <w:t>Viewpoint</w:t>
             </w:r>
@@ -1048,15 +756,13 @@
               <w:cnfStyle w:val="000000100000" w:firstRow="0" w:lastRow="0" w:firstColumn="0" w:lastColumn="0" w:oddVBand="0" w:evenVBand="0" w:oddHBand="1" w:evenHBand="0" w:firstRowFirstColumn="0" w:firstRowLastColumn="0" w:lastRowFirstColumn="0" w:lastRowLastColumn="0"/>
               <w:rPr>
                 <w:rFonts w:ascii="Arial" w:hAnsi="Arial" w:cs="Arial"/>
-                <w:sz w:val="20"/>
-                <w:szCs w:val="20"/>
-              </w:rPr>
-            </w:pPr>
-            <w:r>
-              <w:rPr>
-                <w:rFonts w:ascii="Arial" w:hAnsi="Arial" w:cs="Arial"/>
-                <w:sz w:val="20"/>
-                <w:szCs w:val="20"/>
+                <w:sz w:val="22"/>
+              </w:rPr>
+            </w:pPr>
+            <w:r>
+              <w:rPr>
+                <w:rFonts w:ascii="Arial" w:hAnsi="Arial" w:cs="Arial"/>
+                <w:sz w:val="22"/>
               </w:rPr>
               <w:t>UI Wireframe / Mockup (Desktop &amp; Mobile).</w:t>
             </w:r>

</xml_diff>